<commit_message>
Resolve os 11 registros em VERIFICAR da triagem por saúde mental
Consulta resumo ou texto completo nas fontes abertas e fecha a decisão dos
nove registros da lista por resumo e dos dois confirmados que dependiam do
texto completo. Atualiza documento, JSON e README com os totais finais.

Co-Authored-By: Claude Fable 5.1 <noreply@anthropic.com>
Claude-Session: https://claude.ai/code/session_012CsSfJexFUi5z9DjTPfcUs
</commit_message>
<xml_diff>
--- a/data/revisoes/handebol_saude_mental/INCLUIDOS_MAPPING_HANDEBOL_corrigido.docx
+++ b/data/revisoes/handebol_saude_mental/INCLUIDOS_MAPPING_HANDEBOL_corrigido.docx
@@ -102,7 +102,7 @@
           </w:tcPr>
           <w:p>
             <w:r>
-              <w:t>75</w:t>
+              <w:t>76</w:t>
             </w:r>
           </w:p>
         </w:tc>
@@ -134,7 +134,7 @@
           </w:tcPr>
           <w:p>
             <w:r>
-              <w:t>21</w:t>
+              <w:t>22</w:t>
             </w:r>
           </w:p>
         </w:tc>
@@ -166,7 +166,7 @@
           </w:tcPr>
           <w:p>
             <w:r>
-              <w:t>9</w:t>
+              <w:t>0</w:t>
             </w:r>
           </w:p>
         </w:tc>
@@ -176,7 +176,7 @@
           </w:tcPr>
           <w:p>
             <w:r>
-              <w:t>2</w:t>
+              <w:t>0</w:t>
             </w:r>
           </w:p>
         </w:tc>
@@ -198,7 +198,7 @@
           </w:tcPr>
           <w:p>
             <w:r>
-              <w:t>6</w:t>
+              <w:t>11</w:t>
             </w:r>
           </w:p>
         </w:tc>
@@ -230,7 +230,7 @@
           </w:tcPr>
           <w:p>
             <w:r>
-              <w:t>72</w:t>
+              <w:t>74</w:t>
             </w:r>
           </w:p>
         </w:tc>
@@ -240,7 +240,7 @@
           </w:tcPr>
           <w:p>
             <w:r>
-              <w:t>7</w:t>
+              <w:t>9</w:t>
             </w:r>
           </w:p>
         </w:tc>
@@ -288,7 +288,7 @@
           <w:b w:val="0"/>
           <w:i w:val="0"/>
         </w:rPr>
-        <w:t>Seguem para a próxima fase (texto completo) os marcados ENTRA e ENTRA (limítrofe); os VERIFICAR precisam do texto completo só para decidir; os NÃO ENTRA saem do eixo de saúde mental.</w:t>
+        <w:t>Seguem para a próxima fase (texto completo) os marcados ENTRA e ENTRA (limítrofe); não restou nenhum VERIFICAR; os NÃO ENTRA saem do eixo de saúde mental.</w:t>
       </w:r>
     </w:p>
     <w:p>
@@ -312,10 +312,10 @@
           <w:b/>
           <w:color w:val="1B7F3B"/>
         </w:rPr>
-        <w:t xml:space="preserve">ENTRA (75): </w:t>
-      </w:r>
-      <w:r>
-        <w:t>1, 12, 14, 17, 18, 27, 28, 29, 31, 33, 39, 41, 44, 45, 46, 49, 53, 56, 59, 62, 63, 65, 67, 68, 70, 74, 75, 79, 84, 86, 87, 91, 93, 95, 98, 107, 108, 110, 112, 113, 117, 119, 121, 125, 126, 128, 129, 143, 145, 149, 150, 154, 156, 158, 162, 163, 165, 166, 167, 169, 170, 174, 176, 180, 183, 186, 189, 190, 191, 192, 193, 199, 200, 206, 209</w:t>
+        <w:t xml:space="preserve">ENTRA (76): </w:t>
+      </w:r>
+      <w:r>
+        <w:t>1, 12, 14, 17, 18, 27, 28, 29, 31, 33, 39, 41, 42, 44, 45, 46, 49, 53, 56, 59, 62, 63, 65, 67, 68, 70, 74, 75, 79, 84, 86, 87, 91, 93, 95, 98, 107, 108, 110, 112, 113, 117, 119, 121, 125, 126, 128, 129, 143, 145, 149, 150, 154, 156, 158, 162, 163, 165, 166, 167, 169, 170, 174, 176, 180, 183, 186, 189, 190, 191, 192, 193, 199, 200, 206, 209</w:t>
       </w:r>
     </w:p>
     <w:p>
@@ -327,10 +327,10 @@
           <w:b/>
           <w:color w:val="4F8A10"/>
         </w:rPr>
-        <w:t xml:space="preserve">ENTRA (limítrofe) (21): </w:t>
-      </w:r>
-      <w:r>
-        <w:t>16, 61, 76, 78, 85, 99, 100, 116, 139, 140, 153, 160, 175, 177, 179, 182, 187, 195, 201, 203, 210</w:t>
+        <w:t xml:space="preserve">ENTRA (limítrofe) (22): </w:t>
+      </w:r>
+      <w:r>
+        <w:t>16, 61, 76, 78, 85, 99, 100, 116, 139, 140, 153, 160, 168, 175, 177, 179, 182, 187, 195, 201, 203, 210</w:t>
       </w:r>
     </w:p>
     <w:p>
@@ -342,11 +342,9 @@
           <w:b/>
           <w:color w:val="B37A00"/>
         </w:rPr>
-        <w:t xml:space="preserve">VERIFICAR (9): </w:t>
-      </w:r>
-      <w:r>
-        <w:t>2, 25, 42, 71, 132, 136, 161, 168, 172</w:t>
-      </w:r>
+        <w:t xml:space="preserve">VERIFICAR (0): </w:t>
+      </w:r>
+      <w:r/>
     </w:p>
     <w:p>
       <w:pPr>
@@ -357,10 +355,10 @@
           <w:b/>
           <w:color w:val="B03A2E"/>
         </w:rPr>
-        <w:t xml:space="preserve">NÃO ENTRA (limítrofe) (6): </w:t>
-      </w:r>
-      <w:r>
-        <w:t>51, 94, 115, 141, 148, 171</w:t>
+        <w:t xml:space="preserve">NÃO ENTRA (limítrofe) (11): </w:t>
+      </w:r>
+      <w:r>
+        <w:t>25, 51, 71, 94, 115, 132, 141, 148, 161, 171, 172</w:t>
       </w:r>
     </w:p>
     <w:p>
@@ -372,10 +370,10 @@
           <w:b/>
           <w:color w:val="A61B1B"/>
         </w:rPr>
-        <w:t xml:space="preserve">NÃO ENTRA (72): </w:t>
-      </w:r>
-      <w:r>
-        <w:t>4, 5, 6, 7, 8, 10, 13, 15, 19, 20, 21, 22, 23, 26, 32, 34, 36, 38, 40, 43, 47, 54, 55, 57, 58, 60, 64, 69, 72, 73, 77, 80, 81, 82, 83, 88, 90, 96, 97, 102, 103, 106, 109, 111, 118, 120, 122, 124, 127, 131, 133, 134, 137, 138, 142, 146, 151, 152, 155, 159, 164, 173, 181, 184, 188, 194, 196, 198, 204, 205, 208, 211</w:t>
+        <w:t xml:space="preserve">NÃO ENTRA (74): </w:t>
+      </w:r>
+      <w:r>
+        <w:t>2, 4, 5, 6, 7, 8, 10, 13, 15, 19, 20, 21, 22, 23, 26, 32, 34, 36, 38, 40, 43, 47, 54, 55, 57, 58, 60, 64, 69, 72, 73, 77, 80, 81, 82, 83, 88, 90, 96, 97, 102, 103, 106, 109, 111, 118, 120, 122, 124, 127, 131, 133, 134, 136, 137, 138, 142, 146, 151, 152, 155, 159, 164, 173, 181, 184, 188, 194, 196, 198, 204, 205, 208, 211</w:t>
       </w:r>
     </w:p>
     <w:p>
@@ -1400,12 +1398,12 @@
       <w:r>
         <w:rPr>
           <w:b/>
-          <w:color w:val="B37A00"/>
-        </w:rPr>
-        <w:t xml:space="preserve">Saúde mental: VERIFICAR. </w:t>
-      </w:r>
-      <w:r>
-        <w:t>"Estresse psicofisiológico" e estado de recuperação; confirmar se o instrumento traz subescala de estresse ou humor ou se é só recuperação física (TQR).</w:t>
+          <w:color w:val="A61B1B"/>
+        </w:rPr>
+        <w:t xml:space="preserve">Saúde mental: NÃO ENTRA. </w:t>
+      </w:r>
+      <w:r>
+        <w:t>Verificado no resumo (J Phys Educ, 2023): respostas psicofisiológicas medidas por PSE da sessão, TRIMP e TQR; recuperação física, sem estresse ou humor.</w:t>
       </w:r>
     </w:p>
     <w:p>
@@ -1556,12 +1554,12 @@
       <w:r>
         <w:rPr>
           <w:b/>
-          <w:color w:val="B37A00"/>
-        </w:rPr>
-        <w:t xml:space="preserve">Saúde mental: VERIFICAR. </w:t>
-      </w:r>
-      <w:r>
-        <w:t>Desligamento psicológico e recuperação ligados ao desempenho; confirmar se exaustão ou bem-estar foram medidos.</w:t>
+          <w:color w:val="A61B1B"/>
+        </w:rPr>
+        <w:t xml:space="preserve">Saúde mental: NÃO ENTRA. </w:t>
+      </w:r>
+      <w:r>
+        <w:t>Verificado no resumo (HSSC, 2026): demandas mentais e físicas, desligamento e desfechos de desempenho (vivacidade cognitiva, força física, desempenho na tarefa e sustentável); sem bem-estar, exaustão ou saúde mental.</w:t>
       </w:r>
     </w:p>
     <w:p>
@@ -1729,12 +1727,12 @@
       <w:r>
         <w:rPr>
           <w:b/>
-          <w:color w:val="B37A00"/>
-        </w:rPr>
-        <w:t xml:space="preserve">Saúde mental: VERIFICAR. </w:t>
-      </w:r>
-      <w:r>
-        <w:t>O programa inclui manejo do estresse e da ativação, mas o desfecho relatado é só o rendimento no ataque; confirmar no texto completo se ansiedade ou estresse foram medidos.</w:t>
+          <w:color w:val="A61B1B"/>
+        </w:rPr>
+        <w:t xml:space="preserve">Saúde mental: NÃO ENTRA. </w:t>
+      </w:r>
+      <w:r>
+        <w:t>Verificado no texto completo (Psicothema, 1998): as variáveis dependentes são só categorias de rendimento no ataque registradas em vídeo (passes, recepções, arremessos); ansiedade, ativação e estresse foram treinados, não medidos.</w:t>
       </w:r>
     </w:p>
     <w:p>
@@ -2812,12 +2810,12 @@
       <w:r>
         <w:rPr>
           <w:b/>
-          <w:color w:val="B37A00"/>
-        </w:rPr>
-        <w:t xml:space="preserve">Saúde mental: VERIFICAR. </w:t>
-      </w:r>
-      <w:r>
-        <w:t>O CPRD traz "controle do estresse" como habilidade, não como sintoma; confirmar se o estudo reporta estresse ou ansiedade como desfecho associado às lesões.</w:t>
+          <w:color w:val="B03A2E"/>
+        </w:rPr>
+        <w:t xml:space="preserve">Saúde mental: NÃO ENTRA (limítrofe). </w:t>
+      </w:r>
+      <w:r>
+        <w:t>Verificado no texto completo (RAMD, 2011): instrumento é o CPRD; "controle do estresse" é escala de recurso/habilidade, não de sintoma; os desfechos são as lesões. Coerente com os nºs 43, 102, 109 e 111.</w:t>
       </w:r>
     </w:p>
     <w:p>
@@ -3610,12 +3608,12 @@
       <w:r>
         <w:rPr>
           <w:b/>
-          <w:color w:val="B37A00"/>
-        </w:rPr>
-        <w:t xml:space="preserve">Saúde mental: VERIFICAR. </w:t>
-      </w:r>
-      <w:r>
-        <w:t>"Recuperação psicológica" no título; confirmar o instrumento (RESTQ-Sport ou TQR) e se há subescala de estresse ou humor (resumo não acessível).</w:t>
+          <w:color w:val="1B7F3B"/>
+        </w:rPr>
+        <w:t xml:space="preserve">Saúde mental: ENTRA. </w:t>
+      </w:r>
+      <w:r>
+        <w:t>Verificado no resumo (Kinesiology, 2015): sintomas de estresse pelo DALDA e VFC antes e depois de 72 h de repouso; respostas "pior que o normal" caíram de 6,1 para 3,4.</w:t>
       </w:r>
     </w:p>
     <w:p>
@@ -5035,12 +5033,12 @@
       <w:r>
         <w:rPr>
           <w:b/>
-          <w:color w:val="B37A00"/>
-        </w:rPr>
-        <w:t xml:space="preserve">Saúde mental: VERIFICAR. </w:t>
-      </w:r>
-      <w:r>
-        <w:t>Sono autorrelatado só como covariável do desempenho diurno; confirmar se a qualidade do sono é reportada como resultado.</w:t>
+          <w:color w:val="B03A2E"/>
+        </w:rPr>
+        <w:t xml:space="preserve">Saúde mental: NÃO ENTRA (limítrofe). </w:t>
+      </w:r>
+      <w:r>
+        <w:t>Verificado no resumo (J Hum Kinet, 2018): sono autorrelatado foi só variável de controle, sem correlação com desempenho; não é desfecho do estudo.</w:t>
       </w:r>
     </w:p>
     <w:p>
@@ -8056,12 +8054,12 @@
       <w:r>
         <w:rPr>
           <w:b/>
-          <w:color w:val="B37A00"/>
-        </w:rPr>
-        <w:t xml:space="preserve">Saúde mental: VERIFICAR. </w:t>
-      </w:r>
-      <w:r>
-        <w:t>Inventário de habilidades mentais com subescala de ansiedade; confirmar se o escore de ansiedade é reportado como resultado por sexo e posição.</w:t>
+          <w:color w:val="B03A2E"/>
+        </w:rPr>
+        <w:t xml:space="preserve">Saúde mental: NÃO ENTRA (limítrofe). </w:t>
+      </w:r>
+      <w:r>
+        <w:t>Verificado no texto completo (Front Psychol, 2022): instrumento é o Bull's Mental Skills Questionnaire; o fator "manejo de ansiedade e concentração" mede habilidade de manejar a ansiedade, não sintoma. Mesma regra do CPRD.</w:t>
       </w:r>
     </w:p>
     <w:p>
@@ -8227,12 +8225,12 @@
       <w:r>
         <w:rPr>
           <w:b/>
-          <w:color w:val="B37A00"/>
-        </w:rPr>
-        <w:t xml:space="preserve">Saúde mental: VERIFICAR. </w:t>
-      </w:r>
-      <w:r>
-        <w:t>"Estados mentais de autorrealização"; construto pouco claro; confirmar se inclui bem-estar ou afeto.</w:t>
+          <w:color w:val="A61B1B"/>
+        </w:rPr>
+        <w:t xml:space="preserve">Saúde mental: NÃO ENTRA. </w:t>
+      </w:r>
+      <w:r>
+        <w:t>Verificado no texto completo (JPES, 2022): fatores de autorrealização e autorregulação (busca de autorrealização, automotivação, incongruência temporal, percepção de mundo, atitude à cognição); sem bem-estar, afeto, ansiedade ou estresse.</w:t>
       </w:r>
     </w:p>
     <w:p>
@@ -9481,12 +9479,12 @@
       <w:r>
         <w:rPr>
           <w:b/>
-          <w:color w:val="B37A00"/>
-        </w:rPr>
-        <w:t xml:space="preserve">Saúde mental: VERIFICAR. </w:t>
-      </w:r>
-      <w:r>
-        <w:t>Fator ansiedade/sobrecarga do questionário de estilo decisório; confirmar se é reportado como resultado.</w:t>
+          <w:color w:val="B03A2E"/>
+        </w:rPr>
+        <w:t xml:space="preserve">Saúde mental: NÃO ENTRA (limítrofe). </w:t>
+      </w:r>
+      <w:r>
+        <w:t>Verificado no resumo (Studia Sportiva, 2024): o fator "ansiedade e sobrecarga" do CETD aparece só como correlação com agilidade (r = 0,105); o construto é estilo decisório, não saúde mental.</w:t>
       </w:r>
     </w:p>
     <w:p>
@@ -9880,12 +9878,12 @@
       <w:r>
         <w:rPr>
           <w:b/>
-          <w:color w:val="B37A00"/>
-        </w:rPr>
-        <w:t xml:space="preserve">Saúde mental: VERIFICAR. </w:t>
-      </w:r>
-      <w:r>
-        <w:t>Entrevistas sobre estressores, preparação mental e enfrentamento rumo a Tóquio; confirmar se descrevem saúde mental ou bem-estar no período.</w:t>
+          <w:color w:val="4F8A10"/>
+        </w:rPr>
+        <w:t xml:space="preserve">Saúde mental: ENTRA (limítrofe). </w:t>
+      </w:r>
+      <w:r>
+        <w:t>Verificado no texto completo (Front Psychol, 2025): estudo qualitativo que descreve exaustão mental, preocupação e isolamento dos jogadores na preparação olímpica durante a pandemia, sem instrumento padronizado.</w:t>
       </w:r>
     </w:p>
     <w:p>
@@ -10108,12 +10106,12 @@
       <w:r>
         <w:rPr>
           <w:b/>
-          <w:color w:val="B37A00"/>
-        </w:rPr>
-        <w:t xml:space="preserve">Saúde mental: VERIFICAR. </w:t>
-      </w:r>
-      <w:r>
-        <w:t>Afetividade negativa e enfrentamento ligados à automedicação; confirmar instrumento e se é reportada como desfecho.</w:t>
+          <w:color w:val="B03A2E"/>
+        </w:rPr>
+        <w:t xml:space="preserve">Saúde mental: NÃO ENTRA (limítrofe). </w:t>
+      </w:r>
+      <w:r>
+        <w:t>Verificado no resumo (IRSS, 2025): afetividade negativa entra como traço psicossocial que define perfil de risco; o desfecho é o uso de analgésicos, não um estado de saúde mental.</w:t>
       </w:r>
     </w:p>
     <w:p>
@@ -12091,7 +12089,7 @@
         <w:pStyle w:val="ListBullet"/>
       </w:pPr>
       <w:r>
-        <w:t>Nove registros ficaram em VERIFICAR porque a decisão depende do texto completo: nºs 2, 25, 42, 71, 132, 136, 161, 168 e 172. Dois dos 16 confirmados também: Brandão (2023) e Ji (2026).</w:t>
+        <w:t>Onze registros tinham ficado em VERIFICAR (nºs 2, 25, 42, 71, 132, 136, 161, 168 e 172, mais Brandão 2023 e Ji 2026 entre os confirmados). Todos foram resolvidos com o resumo ou o texto completo obtidos nas fontes abertas (Psicothema, Redalyc, Frontiers, JPES, Studia Sportiva, Europe PMC, Semantic Scholar, Crossref); o motivo de cada um registra a fonte. Resultado: 2 entram (42 e 168), 9 não entram.</w:t>
       </w:r>
     </w:p>
     <w:p>

</xml_diff>